<commit_message>
Update project name and version in package files; add SurreyHub route and styles; modify Council-Profiles document.
</commit_message>
<xml_diff>
--- a/Council-Profiles.docx
+++ b/Council-Profiles.docx
@@ -14,7 +14,7 @@
           <w:b/>
           <w:bCs/>
         </w:rPr>
-        <w:t>Appendix A: Strategic Authority Profiles</w:t>
+        <w:t>Strategic Authority Profiles</w:t>
       </w:r>
     </w:p>
     <w:p>
@@ -34,6 +34,13 @@
           <w:b/>
           <w:bCs/>
         </w:rPr>
+        <w:br/>
+      </w:r>
+      <w:r>
+        <w:rPr>
+          <w:b/>
+          <w:bCs/>
+        </w:rPr>
         <w:t>Part 1: The "West Surrey" Cohort</w:t>
       </w:r>
     </w:p>
@@ -44,6 +51,13 @@
           <w:bCs/>
         </w:rPr>
       </w:pPr>
+      <w:r>
+        <w:rPr>
+          <w:b/>
+          <w:bCs/>
+        </w:rPr>
+        <w:br/>
+      </w:r>
       <w:r>
         <w:rPr>
           <w:b/>
@@ -244,7 +258,7 @@
         <w:rPr>
           <w:noProof/>
         </w:rPr>
-        <w:pict w14:anchorId="6F62E59C">
+        <w:pict w14:anchorId="0478993F">
           <v:rect id="_x0000_i1035" alt="" style="width:450.85pt;height:.05pt;mso-width-percent:0;mso-height-percent:0;mso-width-percent:0;mso-height-percent:0" o:hrpct="999" o:hralign="center" o:hrstd="t" o:hr="t" fillcolor="#a0a0a0" stroked="f"/>
         </w:pict>
       </w:r>
@@ -360,6 +374,7 @@
           <w:b/>
           <w:bCs/>
         </w:rPr>
+        <w:lastRenderedPageBreak/>
         <w:t>Financial Health: The "Black Hole"</w:t>
       </w:r>
       <w:r>
@@ -388,7 +403,6 @@
           <w:b/>
           <w:bCs/>
         </w:rPr>
-        <w:lastRenderedPageBreak/>
         <w:t>Bailout Status:</w:t>
       </w:r>
       <w:r>
@@ -495,7 +509,7 @@
         <w:rPr>
           <w:noProof/>
         </w:rPr>
-        <w:pict w14:anchorId="550F45DC">
+        <w:pict w14:anchorId="0633E6CA">
           <v:rect id="_x0000_i1034" alt="" style="width:450.85pt;height:.05pt;mso-width-percent:0;mso-height-percent:0;mso-width-percent:0;mso-height-percent:0" o:hrpct="999" o:hralign="center" o:hrstd="t" o:hr="t" fillcolor="#a0a0a0" stroked="f"/>
         </w:pict>
       </w:r>
@@ -717,7 +731,7 @@
         <w:rPr>
           <w:noProof/>
         </w:rPr>
-        <w:pict w14:anchorId="297E65BD">
+        <w:pict w14:anchorId="04959BB7">
           <v:rect id="_x0000_i1033" alt="" style="width:450.85pt;height:.05pt;mso-width-percent:0;mso-height-percent:0;mso-width-percent:0;mso-height-percent:0" o:hrpct="999" o:hralign="center" o:hrstd="t" o:hr="t" fillcolor="#a0a0a0" stroked="f"/>
         </w:pict>
       </w:r>
@@ -743,6 +757,7 @@
           <w:i/>
           <w:iCs/>
         </w:rPr>
+        <w:lastRenderedPageBreak/>
         <w:t>Often overlooked, but carrying significant investment risk and governance issues.</w:t>
       </w:r>
     </w:p>
@@ -785,7 +800,6 @@
           <w:b/>
           <w:bCs/>
         </w:rPr>
-        <w:lastRenderedPageBreak/>
         <w:t>Political Control:</w:t>
       </w:r>
       <w:r>
@@ -930,7 +944,7 @@
         <w:rPr>
           <w:noProof/>
         </w:rPr>
-        <w:pict w14:anchorId="68C600A7">
+        <w:pict w14:anchorId="5ADD0B7F">
           <v:rect id="_x0000_i1032" alt="" style="width:450.85pt;height:.05pt;mso-width-percent:0;mso-height-percent:0;mso-width-percent:0;mso-height-percent:0" o:hrpct="999" o:hralign="center" o:hrstd="t" o:hr="t" fillcolor="#a0a0a0" stroked="f"/>
         </w:pict>
       </w:r>
@@ -1152,7 +1166,15 @@
           <w:i/>
           <w:iCs/>
         </w:rPr>
-        <w:t>"With a 2.89-year land supply and a Best Value Notice for high debt, Runnymede is arguably the weakest link in terms of immediate planning defence. How will the new West Surrey authority protect Runnymede's Green Belt when developers know the council has no defensible housing numbers?"</w:t>
+        <w:t xml:space="preserve">"With a 2.89-year land supply and a Best Value Notice for high debt, Runnymede is arguably the weakest link in terms of immediate planning </w:t>
+      </w:r>
+      <w:r>
+        <w:rPr>
+          <w:i/>
+          <w:iCs/>
+        </w:rPr>
+        <w:lastRenderedPageBreak/>
+        <w:t>defence. How will the new West Surrey authority protect Runnymede's Green Belt when developers know the council has no defensible housing numbers?"</w:t>
       </w:r>
     </w:p>
     <w:p>
@@ -1160,7 +1182,7 @@
         <w:rPr>
           <w:noProof/>
         </w:rPr>
-        <w:pict w14:anchorId="58556F5D">
+        <w:pict w14:anchorId="0319E416">
           <v:rect id="_x0000_i1031" alt="" style="width:450.85pt;height:.05pt;mso-width-percent:0;mso-height-percent:0;mso-width-percent:0;mso-height-percent:0" o:hrpct="999" o:hralign="center" o:hrstd="t" o:hr="t" fillcolor="#a0a0a0" stroked="f"/>
         </w:pict>
       </w:r>
@@ -1177,7 +1199,6 @@
           <w:b/>
           <w:bCs/>
         </w:rPr>
-        <w:lastRenderedPageBreak/>
         <w:t>6. Spelthorne Borough Council: The Billion Pound Landlord</w:t>
       </w:r>
     </w:p>
@@ -1391,7 +1412,7 @@
         <w:rPr>
           <w:noProof/>
         </w:rPr>
-        <w:pict w14:anchorId="0D182E5A">
+        <w:pict w14:anchorId="782525CB">
           <v:rect id="_x0000_i1030" alt="" style="width:450.85pt;height:.05pt;mso-width-percent:0;mso-height-percent:0;mso-width-percent:0;mso-height-percent:0" o:hrpct="999" o:hralign="center" o:hrstd="t" o:hr="t" fillcolor="#a0a0a0" stroked="f"/>
         </w:pict>
       </w:r>
@@ -1408,6 +1429,13 @@
           <w:b/>
           <w:bCs/>
         </w:rPr>
+        <w:br/>
+      </w:r>
+      <w:r>
+        <w:rPr>
+          <w:b/>
+          <w:bCs/>
+        </w:rPr>
         <w:t>Part 2: The "East Surrey" Cohort</w:t>
       </w:r>
     </w:p>
@@ -1418,6 +1446,13 @@
           <w:bCs/>
         </w:rPr>
       </w:pPr>
+      <w:r>
+        <w:rPr>
+          <w:b/>
+          <w:bCs/>
+        </w:rPr>
+        <w:br/>
+      </w:r>
       <w:r>
         <w:rPr>
           <w:b/>
@@ -1570,6 +1605,7 @@
           <w:b/>
           <w:bCs/>
         </w:rPr>
+        <w:lastRenderedPageBreak/>
         <w:t>Planning &amp; Housing: The Gatwick Zone</w:t>
       </w:r>
       <w:r>
@@ -1606,7 +1642,6 @@
           <w:b/>
           <w:bCs/>
         </w:rPr>
-        <w:lastRenderedPageBreak/>
         <w:t>Service Model:</w:t>
       </w:r>
       <w:r>
@@ -1647,7 +1682,7 @@
         <w:rPr>
           <w:noProof/>
         </w:rPr>
-        <w:pict w14:anchorId="69470092">
+        <w:pict w14:anchorId="125028A6">
           <v:rect id="_x0000_i1029" alt="" style="width:450.85pt;height:.05pt;mso-width-percent:0;mso-height-percent:0;mso-width-percent:0;mso-height-percent:0" o:hrpct="999" o:hralign="center" o:hrstd="t" o:hr="t" fillcolor="#a0a0a0" stroked="f"/>
         </w:pict>
       </w:r>
@@ -1851,7 +1886,7 @@
         <w:rPr>
           <w:noProof/>
         </w:rPr>
-        <w:pict w14:anchorId="479E7CD6">
+        <w:pict w14:anchorId="0B57E6F2">
           <v:rect id="_x0000_i1028" alt="" style="width:450.85pt;height:.05pt;mso-width-percent:0;mso-height-percent:0;mso-width-percent:0;mso-height-percent:0" o:hrpct="999" o:hralign="center" o:hrstd="t" o:hr="t" fillcolor="#a0a0a0" stroked="f"/>
         </w:pict>
       </w:r>
@@ -1997,6 +2032,7 @@
           <w:b/>
           <w:bCs/>
         </w:rPr>
+        <w:lastRenderedPageBreak/>
         <w:t>Planning &amp; Housing: The "Green Belt" fortress</w:t>
       </w:r>
       <w:r>
@@ -2033,7 +2069,6 @@
           <w:b/>
           <w:bCs/>
         </w:rPr>
-        <w:lastRenderedPageBreak/>
         <w:t>Services:</w:t>
       </w:r>
       <w:r>
@@ -2074,7 +2109,7 @@
         <w:rPr>
           <w:noProof/>
         </w:rPr>
-        <w:pict w14:anchorId="19084680">
+        <w:pict w14:anchorId="39238BE8">
           <v:rect id="_x0000_i1027" alt="" style="width:450.85pt;height:.05pt;mso-width-percent:0;mso-height-percent:0;mso-width-percent:0;mso-height-percent:0" o:hrpct="999" o:hralign="center" o:hrstd="t" o:hr="t" fillcolor="#a0a0a0" stroked="f"/>
         </w:pict>
       </w:r>
@@ -2278,7 +2313,7 @@
         <w:rPr>
           <w:noProof/>
         </w:rPr>
-        <w:pict w14:anchorId="410F4CBC">
+        <w:pict w14:anchorId="7A188B00">
           <v:rect id="_x0000_i1026" alt="" style="width:450.85pt;height:.05pt;mso-width-percent:0;mso-height-percent:0;mso-width-percent:0;mso-height-percent:0" o:hrpct="999" o:hralign="center" o:hrstd="t" o:hr="t" fillcolor="#a0a0a0" stroked="f"/>
         </w:pict>
       </w:r>
@@ -2442,6 +2477,7 @@
           <w:b/>
           <w:bCs/>
         </w:rPr>
+        <w:lastRenderedPageBreak/>
         <w:t>Services:</w:t>
       </w:r>
       <w:r>
@@ -2464,15 +2500,7 @@
           <w:i/>
           <w:iCs/>
         </w:rPr>
-        <w:t xml:space="preserve">"You are the only council in the East with an adopted Local Plan. Merging with Elmbridge (no plan) and Tandridge (failed plan) risks reopening your </w:t>
-      </w:r>
-      <w:r>
-        <w:rPr>
-          <w:i/>
-          <w:iCs/>
-        </w:rPr>
-        <w:lastRenderedPageBreak/>
-        <w:t>protected sites to meet their unmet housing needs. How will you legally ringfence your adopted housing targets from the aggregated deficit of the new East Surrey authority?"</w:t>
+        <w:t>"You are the only council in the East with an adopted Local Plan. Merging with Elmbridge (no plan) and Tandridge (failed plan) risks reopening your protected sites to meet their unmet housing needs. How will you legally ringfence your adopted housing targets from the aggregated deficit of the new East Surrey authority?"</w:t>
       </w:r>
     </w:p>
     <w:p>
@@ -2480,7 +2508,7 @@
         <w:rPr>
           <w:noProof/>
         </w:rPr>
-        <w:pict w14:anchorId="34752759">
+        <w:pict w14:anchorId="28913695">
           <v:rect id="_x0000_i1025" alt="" style="width:450.85pt;height:.05pt;mso-width-percent:0;mso-height-percent:0;mso-width-percent:0;mso-height-percent:0" o:hrpct="999" o:hralign="center" o:hrstd="t" o:hr="t" fillcolor="#a0a0a0" stroked="f"/>
         </w:pict>
       </w:r>
@@ -2638,7 +2666,11 @@
         <w:t>"You are taking a single, functioning Adult Social Care system and splitting it in two during a funding crisis. What is the transition plan to ensure that a vulnerable adult in Guildford doesn't fall through the cracks when their file is transferred to a new 'West Surrey' system that doesn't exist yet?"</w:t>
       </w:r>
     </w:p>
-    <w:p/>
+    <w:p>
+      <w:r>
+        <w:t xml:space="preserve"> </w:t>
+      </w:r>
+    </w:p>
     <w:sectPr>
       <w:pgSz w:w="11900" w:h="16840"/>
       <w:pgMar w:top="1440" w:right="1440" w:bottom="1440" w:left="1440" w:header="708" w:footer="708" w:gutter="0"/>

</xml_diff>